<commit_message>
feat: unify site copy and clean redundant repo artifacts
Align skin-first specialty order across nav, services, search, and contact forms; unify English Skin care labelling and add Central acne/eczema on EN services and homepage. Consolidate proposal docs under presentations/, move one-off scripts to archive, remove duplicate .claude skills and PM skill clutter.

Co-authored-by: Cursor <cursoragent@cursor.com>
</commit_message>
<xml_diff>
--- a/presentations/Oakville-Full-Proposal.docx
+++ b/presentations/Oakville-Full-Proposal.docx
@@ -9,7 +9,6 @@
           <w:lang w:eastAsia="zh-TW"/>
         </w:rPr>
       </w:pPr>
-      <w:proofErr w:type="gramStart"/>
       <w:r>
         <w:rPr>
           <w:rFonts w:ascii="Arial" w:eastAsia="Microsoft JhengHei" w:hAnsi="Arial"/>
@@ -18,9 +17,8 @@
           <w:sz w:val="40"/>
           <w:lang w:eastAsia="zh-TW"/>
         </w:rPr>
-        <w:t>頤</w:t>
-      </w:r>
-      <w:proofErr w:type="gramEnd"/>
+        <w:t>頤安本草</w:t>
+      </w:r>
       <w:r>
         <w:rPr>
           <w:rFonts w:ascii="Arial" w:eastAsia="Microsoft JhengHei" w:hAnsi="Arial"/>
@@ -29,7 +27,7 @@
           <w:sz w:val="40"/>
           <w:lang w:eastAsia="zh-TW"/>
         </w:rPr>
-        <w:t>安本草</w:t>
+        <w:t xml:space="preserve"> · </w:t>
       </w:r>
       <w:r>
         <w:rPr>
@@ -39,9 +37,8 @@
           <w:sz w:val="40"/>
           <w:lang w:eastAsia="zh-TW"/>
         </w:rPr>
-        <w:t xml:space="preserve"> </w:t>
-      </w:r>
-      <w:proofErr w:type="gramStart"/>
+        <w:t>伍厚臻中醫師</w:t>
+      </w:r>
       <w:r>
         <w:rPr>
           <w:rFonts w:ascii="Arial" w:eastAsia="Microsoft JhengHei" w:hAnsi="Arial"/>
@@ -50,9 +47,8 @@
           <w:sz w:val="40"/>
           <w:lang w:eastAsia="zh-TW"/>
         </w:rPr>
-        <w:t>·</w:t>
-      </w:r>
-      <w:proofErr w:type="gramEnd"/>
+        <w:br/>
+      </w:r>
       <w:r>
         <w:rPr>
           <w:rFonts w:ascii="Arial" w:eastAsia="Microsoft JhengHei" w:hAnsi="Arial"/>
@@ -61,71 +57,7 @@
           <w:sz w:val="40"/>
           <w:lang w:eastAsia="zh-TW"/>
         </w:rPr>
-        <w:t xml:space="preserve"> </w:t>
-      </w:r>
-      <w:r>
-        <w:rPr>
-          <w:rFonts w:ascii="Arial" w:eastAsia="Microsoft JhengHei" w:hAnsi="Arial"/>
-          <w:b/>
-          <w:color w:val="2A463C"/>
-          <w:sz w:val="40"/>
-          <w:lang w:eastAsia="zh-TW"/>
-        </w:rPr>
-        <w:t>伍厚</w:t>
-      </w:r>
-      <w:proofErr w:type="gramStart"/>
-      <w:r>
-        <w:rPr>
-          <w:rFonts w:ascii="Arial" w:eastAsia="Microsoft JhengHei" w:hAnsi="Arial"/>
-          <w:b/>
-          <w:color w:val="2A463C"/>
-          <w:sz w:val="40"/>
-          <w:lang w:eastAsia="zh-TW"/>
-        </w:rPr>
-        <w:t>臻</w:t>
-      </w:r>
-      <w:proofErr w:type="gramEnd"/>
-      <w:r>
-        <w:rPr>
-          <w:rFonts w:ascii="Arial" w:eastAsia="Microsoft JhengHei" w:hAnsi="Arial"/>
-          <w:b/>
-          <w:color w:val="2A463C"/>
-          <w:sz w:val="40"/>
-          <w:lang w:eastAsia="zh-TW"/>
-        </w:rPr>
-        <w:t>中醫師</w:t>
-      </w:r>
-      <w:r>
-        <w:rPr>
-          <w:rFonts w:ascii="Arial" w:eastAsia="Microsoft JhengHei" w:hAnsi="Arial"/>
-          <w:b/>
-          <w:color w:val="2A463C"/>
-          <w:sz w:val="40"/>
-          <w:lang w:eastAsia="zh-TW"/>
-        </w:rPr>
-        <w:br/>
-      </w:r>
-      <w:proofErr w:type="gramStart"/>
-      <w:r>
-        <w:rPr>
-          <w:rFonts w:ascii="Arial" w:eastAsia="Microsoft JhengHei" w:hAnsi="Arial"/>
-          <w:b/>
-          <w:color w:val="2A463C"/>
-          <w:sz w:val="40"/>
-          <w:lang w:eastAsia="zh-TW"/>
-        </w:rPr>
-        <w:t>官網重建</w:t>
-      </w:r>
-      <w:proofErr w:type="gramEnd"/>
-      <w:r>
-        <w:rPr>
-          <w:rFonts w:ascii="Arial" w:eastAsia="Microsoft JhengHei" w:hAnsi="Arial"/>
-          <w:b/>
-          <w:color w:val="2A463C"/>
-          <w:sz w:val="40"/>
-          <w:lang w:eastAsia="zh-TW"/>
-        </w:rPr>
-        <w:t>方案書</w:t>
+        <w:t>官網重建方案書</w:t>
       </w:r>
     </w:p>
     <w:p>
@@ -149,59 +81,23 @@
           <w:sz w:val="24"/>
           <w:lang w:eastAsia="zh-TW"/>
         </w:rPr>
-        <w:t xml:space="preserve"> </w:t>
-      </w:r>
-      <w:proofErr w:type="gramStart"/>
+        <w:t xml:space="preserve"> · </w:t>
+      </w:r>
       <w:r>
         <w:rPr>
           <w:rFonts w:ascii="Arial" w:eastAsia="Microsoft JhengHei" w:hAnsi="Arial"/>
           <w:sz w:val="24"/>
           <w:lang w:eastAsia="zh-TW"/>
         </w:rPr>
-        <w:t>·</w:t>
-      </w:r>
-      <w:proofErr w:type="gramEnd"/>
+        <w:t>網站</w:t>
+      </w:r>
       <w:r>
         <w:rPr>
           <w:rFonts w:ascii="Arial" w:eastAsia="Microsoft JhengHei" w:hAnsi="Arial"/>
           <w:sz w:val="24"/>
           <w:lang w:eastAsia="zh-TW"/>
         </w:rPr>
-        <w:t xml:space="preserve"> </w:t>
-      </w:r>
-      <w:r>
-        <w:rPr>
-          <w:rFonts w:ascii="Arial" w:eastAsia="Microsoft JhengHei" w:hAnsi="Arial"/>
-          <w:sz w:val="24"/>
-          <w:lang w:eastAsia="zh-TW"/>
-        </w:rPr>
-        <w:t>網站</w:t>
-      </w:r>
-      <w:r>
-        <w:rPr>
-          <w:rFonts w:ascii="Arial" w:eastAsia="Microsoft JhengHei" w:hAnsi="Arial"/>
-          <w:sz w:val="24"/>
-          <w:lang w:eastAsia="zh-TW"/>
-        </w:rPr>
-        <w:t xml:space="preserve"> </w:t>
-      </w:r>
-      <w:proofErr w:type="gramStart"/>
-      <w:r>
-        <w:rPr>
-          <w:rFonts w:ascii="Arial" w:eastAsia="Microsoft JhengHei" w:hAnsi="Arial"/>
-          <w:sz w:val="24"/>
-          <w:lang w:eastAsia="zh-TW"/>
-        </w:rPr>
-        <w:t>·</w:t>
-      </w:r>
-      <w:proofErr w:type="gramEnd"/>
-      <w:r>
-        <w:rPr>
-          <w:rFonts w:ascii="Arial" w:eastAsia="Microsoft JhengHei" w:hAnsi="Arial"/>
-          <w:sz w:val="24"/>
-          <w:lang w:eastAsia="zh-TW"/>
-        </w:rPr>
-        <w:t xml:space="preserve"> </w:t>
+        <w:t xml:space="preserve"> · </w:t>
       </w:r>
       <w:r>
         <w:rPr>
@@ -249,52 +145,24 @@
           <w:sz w:val="18"/>
           <w:lang w:eastAsia="zh-TW"/>
         </w:rPr>
-        <w:t xml:space="preserve">月　</w:t>
-      </w:r>
-      <w:proofErr w:type="gramStart"/>
+        <w:t>月　｜頤安本草（</w:t>
+      </w:r>
       <w:r>
         <w:rPr>
           <w:rFonts w:ascii="Arial" w:eastAsia="Microsoft JhengHei" w:hAnsi="Arial"/>
           <w:sz w:val="18"/>
           <w:lang w:eastAsia="zh-TW"/>
         </w:rPr>
-        <w:t>｜頤</w:t>
-      </w:r>
-      <w:proofErr w:type="gramEnd"/>
+        <w:t>Oakville Wellness</w:t>
+      </w:r>
       <w:r>
         <w:rPr>
           <w:rFonts w:ascii="Arial" w:eastAsia="Microsoft JhengHei" w:hAnsi="Arial"/>
           <w:sz w:val="18"/>
           <w:lang w:eastAsia="zh-TW"/>
         </w:rPr>
-        <w:t>安本草（</w:t>
-      </w:r>
-      <w:r>
-        <w:rPr>
-          <w:rFonts w:ascii="Arial" w:eastAsia="Microsoft JhengHei" w:hAnsi="Arial"/>
-          <w:sz w:val="18"/>
-          <w:lang w:eastAsia="zh-TW"/>
-        </w:rPr>
-        <w:t>Oakville Wellness</w:t>
-      </w:r>
-      <w:r>
-        <w:rPr>
-          <w:rFonts w:ascii="Arial" w:eastAsia="Microsoft JhengHei" w:hAnsi="Arial"/>
-          <w:sz w:val="18"/>
-          <w:lang w:eastAsia="zh-TW"/>
-        </w:rPr>
-        <w:t xml:space="preserve">）　</w:t>
-      </w:r>
-      <w:proofErr w:type="gramStart"/>
-      <w:r>
-        <w:rPr>
-          <w:rFonts w:ascii="Arial" w:eastAsia="Microsoft JhengHei" w:hAnsi="Arial"/>
-          <w:sz w:val="18"/>
-          <w:lang w:eastAsia="zh-TW"/>
-        </w:rPr>
-        <w:t>｜</w:t>
-      </w:r>
-      <w:proofErr w:type="gramEnd"/>
+        <w:t>）　｜</w:t>
+      </w:r>
       <w:r>
         <w:rPr>
           <w:rFonts w:ascii="Arial" w:eastAsia="Microsoft JhengHei" w:hAnsi="Arial"/>
@@ -317,25 +185,7 @@
           <w:sz w:val="18"/>
           <w:lang w:eastAsia="zh-TW"/>
         </w:rPr>
-        <w:t>本文件說明重建方向與具體安排；費用及合約</w:t>
-      </w:r>
-      <w:proofErr w:type="gramStart"/>
-      <w:r>
-        <w:rPr>
-          <w:rFonts w:ascii="Arial" w:eastAsia="Microsoft JhengHei" w:hAnsi="Arial"/>
-          <w:sz w:val="18"/>
-          <w:lang w:eastAsia="zh-TW"/>
-        </w:rPr>
-        <w:t>條款另載於</w:t>
-      </w:r>
-      <w:proofErr w:type="gramEnd"/>
-      <w:r>
-        <w:rPr>
-          <w:rFonts w:ascii="Arial" w:eastAsia="Microsoft JhengHei" w:hAnsi="Arial"/>
-          <w:sz w:val="18"/>
-          <w:lang w:eastAsia="zh-TW"/>
-        </w:rPr>
-        <w:t>《綜合報價單》，兩份文件分開閱讀。</w:t>
+        <w:t>本文件說明重建方向與具體安排；費用及合約條款另載於《綜合報價單》，兩份文件分開閱讀。</w:t>
       </w:r>
     </w:p>
     <w:p>
@@ -381,51 +231,15 @@
           <w:sz w:val="19"/>
           <w:lang w:eastAsia="zh-TW"/>
         </w:rPr>
-        <w:t xml:space="preserve"> </w:t>
-      </w:r>
-      <w:proofErr w:type="gramStart"/>
+        <w:t xml:space="preserve"> — </w:t>
+      </w:r>
       <w:r>
         <w:rPr>
           <w:rFonts w:ascii="Arial" w:eastAsia="Microsoft JhengHei" w:hAnsi="Arial"/>
           <w:sz w:val="19"/>
           <w:lang w:eastAsia="zh-TW"/>
         </w:rPr>
-        <w:t>—</w:t>
-      </w:r>
-      <w:proofErr w:type="gramEnd"/>
-      <w:r>
-        <w:rPr>
-          <w:rFonts w:ascii="Arial" w:eastAsia="Microsoft JhengHei" w:hAnsi="Arial"/>
-          <w:sz w:val="19"/>
-          <w:lang w:eastAsia="zh-TW"/>
-        </w:rPr>
-        <w:t xml:space="preserve"> </w:t>
-      </w:r>
-      <w:r>
-        <w:rPr>
-          <w:rFonts w:ascii="Arial" w:eastAsia="Microsoft JhengHei" w:hAnsi="Arial"/>
-          <w:sz w:val="19"/>
-          <w:lang w:eastAsia="zh-TW"/>
-        </w:rPr>
-        <w:t>為何重建、對標借</w:t>
-      </w:r>
-      <w:proofErr w:type="gramStart"/>
-      <w:r>
-        <w:rPr>
-          <w:rFonts w:ascii="Arial" w:eastAsia="Microsoft JhengHei" w:hAnsi="Arial"/>
-          <w:sz w:val="19"/>
-          <w:lang w:eastAsia="zh-TW"/>
-        </w:rPr>
-        <w:t>鑑</w:t>
-      </w:r>
-      <w:proofErr w:type="gramEnd"/>
-      <w:r>
-        <w:rPr>
-          <w:rFonts w:ascii="Arial" w:eastAsia="Microsoft JhengHei" w:hAnsi="Arial"/>
-          <w:sz w:val="19"/>
-          <w:lang w:eastAsia="zh-TW"/>
-        </w:rPr>
-        <w:t>、品牌定位</w:t>
+        <w:t>為何重建、對標借鑑、品牌定位</w:t>
       </w:r>
     </w:p>
     <w:p>
@@ -449,25 +263,7 @@
           <w:sz w:val="19"/>
           <w:lang w:eastAsia="zh-TW"/>
         </w:rPr>
-        <w:t xml:space="preserve"> </w:t>
-      </w:r>
-      <w:proofErr w:type="gramStart"/>
-      <w:r>
-        <w:rPr>
-          <w:rFonts w:ascii="Arial" w:eastAsia="Microsoft JhengHei" w:hAnsi="Arial"/>
-          <w:sz w:val="19"/>
-          <w:lang w:eastAsia="zh-TW"/>
-        </w:rPr>
-        <w:t>—</w:t>
-      </w:r>
-      <w:proofErr w:type="gramEnd"/>
-      <w:r>
-        <w:rPr>
-          <w:rFonts w:ascii="Arial" w:eastAsia="Microsoft JhengHei" w:hAnsi="Arial"/>
-          <w:sz w:val="19"/>
-          <w:lang w:eastAsia="zh-TW"/>
-        </w:rPr>
-        <w:t xml:space="preserve"> </w:t>
+        <w:t xml:space="preserve"> — </w:t>
       </w:r>
       <w:r>
         <w:rPr>
@@ -499,25 +295,7 @@
           <w:sz w:val="19"/>
           <w:lang w:eastAsia="zh-TW"/>
         </w:rPr>
-        <w:t xml:space="preserve"> </w:t>
-      </w:r>
-      <w:proofErr w:type="gramStart"/>
-      <w:r>
-        <w:rPr>
-          <w:rFonts w:ascii="Arial" w:eastAsia="Microsoft JhengHei" w:hAnsi="Arial"/>
-          <w:sz w:val="19"/>
-          <w:lang w:eastAsia="zh-TW"/>
-        </w:rPr>
-        <w:t>—</w:t>
-      </w:r>
-      <w:proofErr w:type="gramEnd"/>
-      <w:r>
-        <w:rPr>
-          <w:rFonts w:ascii="Arial" w:eastAsia="Microsoft JhengHei" w:hAnsi="Arial"/>
-          <w:sz w:val="19"/>
-          <w:lang w:eastAsia="zh-TW"/>
-        </w:rPr>
-        <w:t xml:space="preserve"> </w:t>
+        <w:t xml:space="preserve"> — </w:t>
       </w:r>
       <w:r>
         <w:rPr>
@@ -584,23 +362,21 @@
           <w:lang w:eastAsia="zh-TW"/>
         </w:rPr>
       </w:pPr>
-      <w:proofErr w:type="gramStart"/>
       <w:r>
         <w:rPr>
           <w:rFonts w:ascii="Arial" w:eastAsia="Microsoft JhengHei" w:hAnsi="Arial"/>
           <w:sz w:val="21"/>
           <w:lang w:eastAsia="zh-TW"/>
         </w:rPr>
-        <w:t>現行官網內容</w:t>
-      </w:r>
-      <w:proofErr w:type="gramEnd"/>
+        <w:t>現行官網內容太少，客人從</w:t>
+      </w:r>
       <w:r>
         <w:rPr>
           <w:rFonts w:ascii="Arial" w:eastAsia="Microsoft JhengHei" w:hAnsi="Arial"/>
           <w:sz w:val="21"/>
           <w:lang w:eastAsia="zh-TW"/>
         </w:rPr>
-        <w:t>太少，客人從</w:t>
+        <w:t xml:space="preserve"> Google </w:t>
       </w:r>
       <w:r>
         <w:rPr>
@@ -608,7 +384,7 @@
           <w:sz w:val="21"/>
           <w:lang w:eastAsia="zh-TW"/>
         </w:rPr>
-        <w:t xml:space="preserve"> Google </w:t>
+        <w:t>搜尋「中環</w:t>
       </w:r>
       <w:r>
         <w:rPr>
@@ -616,7 +392,7 @@
           <w:sz w:val="21"/>
           <w:lang w:eastAsia="zh-TW"/>
         </w:rPr>
-        <w:t>搜尋「中環</w:t>
+        <w:t xml:space="preserve"> </w:t>
       </w:r>
       <w:r>
         <w:rPr>
@@ -624,6 +400,14 @@
           <w:sz w:val="21"/>
           <w:lang w:eastAsia="zh-TW"/>
         </w:rPr>
+        <w:t>濕疹</w:t>
+      </w:r>
+      <w:r>
+        <w:rPr>
+          <w:rFonts w:ascii="Arial" w:eastAsia="Microsoft JhengHei" w:hAnsi="Arial"/>
+          <w:sz w:val="21"/>
+          <w:lang w:eastAsia="zh-TW"/>
+        </w:rPr>
         <w:t xml:space="preserve"> </w:t>
       </w:r>
       <w:r>
@@ -632,41 +416,7 @@
           <w:sz w:val="21"/>
           <w:lang w:eastAsia="zh-TW"/>
         </w:rPr>
-        <w:t>濕疹</w:t>
-      </w:r>
-      <w:r>
-        <w:rPr>
-          <w:rFonts w:ascii="Arial" w:eastAsia="Microsoft JhengHei" w:hAnsi="Arial"/>
-          <w:sz w:val="21"/>
-          <w:lang w:eastAsia="zh-TW"/>
-        </w:rPr>
-        <w:t xml:space="preserve"> </w:t>
-      </w:r>
-      <w:r>
-        <w:rPr>
-          <w:rFonts w:ascii="Arial" w:eastAsia="Microsoft JhengHei" w:hAnsi="Arial"/>
-          <w:sz w:val="21"/>
-          <w:lang w:eastAsia="zh-TW"/>
-        </w:rPr>
-        <w:t>中醫」或朋友轉</w:t>
-      </w:r>
-      <w:proofErr w:type="gramStart"/>
-      <w:r>
-        <w:rPr>
-          <w:rFonts w:ascii="Arial" w:eastAsia="Microsoft JhengHei" w:hAnsi="Arial"/>
-          <w:sz w:val="21"/>
-          <w:lang w:eastAsia="zh-TW"/>
-        </w:rPr>
-        <w:t>介</w:t>
-      </w:r>
-      <w:proofErr w:type="gramEnd"/>
-      <w:r>
-        <w:rPr>
-          <w:rFonts w:ascii="Arial" w:eastAsia="Microsoft JhengHei" w:hAnsi="Arial"/>
-          <w:sz w:val="21"/>
-          <w:lang w:eastAsia="zh-TW"/>
-        </w:rPr>
-        <w:t>來時，往往找不到足夠資訊，也難以放心預約。</w:t>
+        <w:t>中醫」或朋友轉介來時，往往找不到足夠資訊，也難以放心預約。</w:t>
       </w:r>
     </w:p>
     <w:p>
@@ -683,9 +433,8 @@
           <w:sz w:val="21"/>
           <w:lang w:eastAsia="zh-TW"/>
         </w:rPr>
-        <w:t>本方案為</w:t>
-      </w:r>
-      <w:proofErr w:type="gramStart"/>
+        <w:t>本方案為頤安本草重建一套完整官網：共</w:t>
+      </w:r>
       <w:r>
         <w:rPr>
           <w:rFonts w:ascii="Arial" w:eastAsia="Microsoft JhengHei" w:hAnsi="Arial"/>
@@ -693,9 +442,8 @@
           <w:sz w:val="21"/>
           <w:lang w:eastAsia="zh-TW"/>
         </w:rPr>
-        <w:t>頤</w:t>
-      </w:r>
-      <w:proofErr w:type="gramEnd"/>
+        <w:t xml:space="preserve"> 62 </w:t>
+      </w:r>
       <w:r>
         <w:rPr>
           <w:rFonts w:ascii="Arial" w:eastAsia="Microsoft JhengHei" w:hAnsi="Arial"/>
@@ -703,56 +451,7 @@
           <w:sz w:val="21"/>
           <w:lang w:eastAsia="zh-TW"/>
         </w:rPr>
-        <w:t>安本草重建一套</w:t>
-      </w:r>
-      <w:proofErr w:type="gramStart"/>
-      <w:r>
-        <w:rPr>
-          <w:rFonts w:ascii="Arial" w:eastAsia="Microsoft JhengHei" w:hAnsi="Arial"/>
-          <w:b/>
-          <w:sz w:val="21"/>
-          <w:lang w:eastAsia="zh-TW"/>
-        </w:rPr>
-        <w:t>完整官網</w:t>
-      </w:r>
-      <w:proofErr w:type="gramEnd"/>
-      <w:r>
-        <w:rPr>
-          <w:rFonts w:ascii="Arial" w:eastAsia="Microsoft JhengHei" w:hAnsi="Arial"/>
-          <w:b/>
-          <w:sz w:val="21"/>
-          <w:lang w:eastAsia="zh-TW"/>
-        </w:rPr>
-        <w:t>：共</w:t>
-      </w:r>
-      <w:r>
-        <w:rPr>
-          <w:rFonts w:ascii="Arial" w:eastAsia="Microsoft JhengHei" w:hAnsi="Arial"/>
-          <w:b/>
-          <w:sz w:val="21"/>
-          <w:lang w:eastAsia="zh-TW"/>
-        </w:rPr>
-        <w:t xml:space="preserve"> 62 </w:t>
-      </w:r>
-      <w:proofErr w:type="gramStart"/>
-      <w:r>
-        <w:rPr>
-          <w:rFonts w:ascii="Arial" w:eastAsia="Microsoft JhengHei" w:hAnsi="Arial"/>
-          <w:b/>
-          <w:sz w:val="21"/>
-          <w:lang w:eastAsia="zh-TW"/>
-        </w:rPr>
-        <w:t>個</w:t>
-      </w:r>
-      <w:proofErr w:type="gramEnd"/>
-      <w:r>
-        <w:rPr>
-          <w:rFonts w:ascii="Arial" w:eastAsia="Microsoft JhengHei" w:hAnsi="Arial"/>
-          <w:b/>
-          <w:sz w:val="21"/>
-          <w:lang w:eastAsia="zh-TW"/>
-        </w:rPr>
-        <w:t>中英頁面，清楚介紹專科、常見症狀、診所環境與收費，並把預約統一導向</w:t>
+        <w:t>個中英頁面，清楚介紹專科、常見症狀、診所環境與收費，並把預約統一導向</w:t>
       </w:r>
       <w:r>
         <w:rPr>
@@ -786,36 +485,16 @@
           <w:sz w:val="21"/>
           <w:lang w:eastAsia="zh-TW"/>
         </w:rPr>
-        <w:t>整體定位：中環高端、專業合</w:t>
-      </w:r>
-      <w:proofErr w:type="gramStart"/>
+        <w:t>整體定位：中環高端、專業合規、循本溯源</w:t>
+      </w:r>
       <w:r>
         <w:rPr>
           <w:rFonts w:ascii="Arial" w:eastAsia="Microsoft JhengHei" w:hAnsi="Arial"/>
           <w:sz w:val="21"/>
           <w:lang w:eastAsia="zh-TW"/>
         </w:rPr>
-        <w:t>規</w:t>
-      </w:r>
-      <w:proofErr w:type="gramEnd"/>
-      <w:r>
-        <w:rPr>
-          <w:rFonts w:ascii="Arial" w:eastAsia="Microsoft JhengHei" w:hAnsi="Arial"/>
-          <w:sz w:val="21"/>
-          <w:lang w:eastAsia="zh-TW"/>
-        </w:rPr>
-        <w:t>、循本溯源</w:t>
-      </w:r>
-      <w:proofErr w:type="gramStart"/>
-      <w:r>
-        <w:rPr>
-          <w:rFonts w:ascii="Arial" w:eastAsia="Microsoft JhengHei" w:hAnsi="Arial"/>
-          <w:sz w:val="21"/>
-          <w:lang w:eastAsia="zh-TW"/>
-        </w:rPr>
         <w:t>——</w:t>
       </w:r>
-      <w:proofErr w:type="gramEnd"/>
       <w:r>
         <w:rPr>
           <w:rFonts w:ascii="Arial" w:eastAsia="Microsoft JhengHei" w:hAnsi="Arial"/>
@@ -1003,25 +682,7 @@
                 <w:sz w:val="18"/>
                 <w:lang w:eastAsia="zh-TW"/>
               </w:rPr>
-              <w:t>濕疹、暗瘡、失眠、</w:t>
-            </w:r>
-            <w:proofErr w:type="gramStart"/>
-            <w:r>
-              <w:rPr>
-                <w:rFonts w:ascii="Arial" w:eastAsia="Microsoft JhengHei" w:hAnsi="Arial"/>
-                <w:sz w:val="18"/>
-                <w:lang w:eastAsia="zh-TW"/>
-              </w:rPr>
-              <w:t>備孕等</w:t>
-            </w:r>
-            <w:proofErr w:type="gramEnd"/>
-            <w:r>
-              <w:rPr>
-                <w:rFonts w:ascii="Arial" w:eastAsia="Microsoft JhengHei" w:hAnsi="Arial"/>
-                <w:sz w:val="18"/>
-                <w:lang w:eastAsia="zh-TW"/>
-              </w:rPr>
-              <w:t>客人無專門入口</w:t>
+              <w:t>濕疹、暗瘡、失眠、備孕等客人無專門入口</w:t>
             </w:r>
           </w:p>
         </w:tc>
@@ -1152,25 +813,7 @@
                 <w:sz w:val="18"/>
                 <w:lang w:eastAsia="zh-TW"/>
               </w:rPr>
-              <w:t>「</w:t>
-            </w:r>
-            <w:proofErr w:type="gramStart"/>
-            <w:r>
-              <w:rPr>
-                <w:rFonts w:ascii="Arial" w:eastAsia="Microsoft JhengHei" w:hAnsi="Arial"/>
-                <w:sz w:val="18"/>
-                <w:lang w:eastAsia="zh-TW"/>
-              </w:rPr>
-              <w:t>頤</w:t>
-            </w:r>
-            <w:proofErr w:type="gramEnd"/>
-            <w:r>
-              <w:rPr>
-                <w:rFonts w:ascii="Arial" w:eastAsia="Microsoft JhengHei" w:hAnsi="Arial"/>
-                <w:sz w:val="18"/>
-                <w:lang w:eastAsia="zh-TW"/>
-              </w:rPr>
-              <w:t>安本草」難以被記住</w:t>
+              <w:t>「頤安本草」難以被記住</w:t>
             </w:r>
           </w:p>
         </w:tc>
@@ -1195,25 +838,7 @@
                 <w:sz w:val="18"/>
                 <w:lang w:eastAsia="zh-TW"/>
               </w:rPr>
-              <w:t>無法知道哪</w:t>
-            </w:r>
-            <w:proofErr w:type="gramStart"/>
-            <w:r>
-              <w:rPr>
-                <w:rFonts w:ascii="Arial" w:eastAsia="Microsoft JhengHei" w:hAnsi="Arial"/>
-                <w:sz w:val="18"/>
-                <w:lang w:eastAsia="zh-TW"/>
-              </w:rPr>
-              <w:t>個</w:t>
-            </w:r>
-            <w:proofErr w:type="gramEnd"/>
-            <w:r>
-              <w:rPr>
-                <w:rFonts w:ascii="Arial" w:eastAsia="Microsoft JhengHei" w:hAnsi="Arial"/>
-                <w:sz w:val="18"/>
-                <w:lang w:eastAsia="zh-TW"/>
-              </w:rPr>
-              <w:t>渠道帶來預約</w:t>
+              <w:t>無法知道哪個渠道帶來預約</w:t>
             </w:r>
           </w:p>
         </w:tc>
@@ -1269,27 +894,7 @@
           <w:sz w:val="23"/>
           <w:lang w:eastAsia="zh-TW"/>
         </w:rPr>
-        <w:t>行業參考：</w:t>
-      </w:r>
-      <w:proofErr w:type="gramStart"/>
-      <w:r>
-        <w:rPr>
-          <w:rFonts w:ascii="Arial" w:eastAsia="Microsoft JhengHei" w:hAnsi="Arial"/>
-          <w:b/>
-          <w:sz w:val="23"/>
-          <w:lang w:eastAsia="zh-TW"/>
-        </w:rPr>
-        <w:t>養康中醫</w:t>
-      </w:r>
-      <w:proofErr w:type="gramEnd"/>
-      <w:r>
-        <w:rPr>
-          <w:rFonts w:ascii="Arial" w:eastAsia="Microsoft JhengHei" w:hAnsi="Arial"/>
-          <w:b/>
-          <w:sz w:val="23"/>
-          <w:lang w:eastAsia="zh-TW"/>
-        </w:rPr>
-        <w:t>館</w:t>
+        <w:t>行業參考：養康中醫館</w:t>
       </w:r>
     </w:p>
     <w:p>
@@ -1299,23 +904,13 @@
           <w:lang w:eastAsia="zh-TW"/>
         </w:rPr>
       </w:pPr>
-      <w:proofErr w:type="gramStart"/>
       <w:r>
         <w:rPr>
           <w:rFonts w:ascii="Arial" w:eastAsia="Microsoft JhengHei" w:hAnsi="Arial"/>
           <w:sz w:val="20"/>
           <w:lang w:eastAsia="zh-TW"/>
         </w:rPr>
-        <w:t>養康官網</w:t>
-      </w:r>
-      <w:proofErr w:type="gramEnd"/>
-      <w:r>
-        <w:rPr>
-          <w:rFonts w:ascii="Arial" w:eastAsia="Microsoft JhengHei" w:hAnsi="Arial"/>
-          <w:sz w:val="20"/>
-          <w:lang w:eastAsia="zh-TW"/>
-        </w:rPr>
-        <w:t>在業內表現突出，以下做法值得參考，但不必照搬：</w:t>
+        <w:t>養康官網在業內表現突出，以下做法值得參考，但不必照搬：</w:t>
       </w:r>
     </w:p>
     <w:tbl>
@@ -1447,23 +1042,13 @@
                 <w:lang w:eastAsia="zh-TW"/>
               </w:rPr>
             </w:pPr>
-            <w:proofErr w:type="gramStart"/>
             <w:r>
               <w:rPr>
                 <w:rFonts w:ascii="Arial" w:eastAsia="Microsoft JhengHei" w:hAnsi="Arial"/>
                 <w:sz w:val="18"/>
                 <w:lang w:eastAsia="zh-TW"/>
               </w:rPr>
-              <w:t>首診免診金</w:t>
-            </w:r>
-            <w:proofErr w:type="gramEnd"/>
-            <w:r>
-              <w:rPr>
-                <w:rFonts w:ascii="Arial" w:eastAsia="Microsoft JhengHei" w:hAnsi="Arial"/>
-                <w:sz w:val="18"/>
-                <w:lang w:eastAsia="zh-TW"/>
-              </w:rPr>
-              <w:t>、高折扣促銷</w:t>
+              <w:t>首診免診金、高折扣促銷</w:t>
             </w:r>
           </w:p>
         </w:tc>
@@ -1520,18 +1105,8 @@
                 <w:sz w:val="18"/>
                 <w:lang w:eastAsia="zh-TW"/>
               </w:rPr>
-              <w:t>誇大療效、</w:t>
-            </w:r>
-            <w:proofErr w:type="gramStart"/>
-            <w:r>
-              <w:rPr>
-                <w:rFonts w:ascii="Arial" w:eastAsia="Microsoft JhengHei" w:hAnsi="Arial"/>
-                <w:sz w:val="18"/>
-                <w:lang w:eastAsia="zh-TW"/>
-              </w:rPr>
-              <w:t>論壇軟文灌水</w:t>
-            </w:r>
-            <w:proofErr w:type="gramEnd"/>
+              <w:t>誇大療效、論壇軟文灌水</w:t>
+            </w:r>
           </w:p>
         </w:tc>
       </w:tr>
@@ -1596,25 +1171,7 @@
                 <w:sz w:val="18"/>
                 <w:lang w:eastAsia="zh-TW"/>
               </w:rPr>
-              <w:t>社交媒體</w:t>
-            </w:r>
-            <w:proofErr w:type="gramStart"/>
-            <w:r>
-              <w:rPr>
-                <w:rFonts w:ascii="Arial" w:eastAsia="Microsoft JhengHei" w:hAnsi="Arial"/>
-                <w:sz w:val="18"/>
-                <w:lang w:eastAsia="zh-TW"/>
-              </w:rPr>
-              <w:t>與官網互相</w:t>
-            </w:r>
-            <w:proofErr w:type="gramEnd"/>
-            <w:r>
-              <w:rPr>
-                <w:rFonts w:ascii="Arial" w:eastAsia="Microsoft JhengHei" w:hAnsi="Arial"/>
-                <w:sz w:val="18"/>
-                <w:lang w:eastAsia="zh-TW"/>
-              </w:rPr>
-              <w:t>導流</w:t>
+              <w:t>社交媒體與官網互相導流</w:t>
             </w:r>
           </w:p>
         </w:tc>
@@ -1769,16 +1326,15 @@
                 <w:sz w:val="18"/>
                 <w:lang w:eastAsia="zh-TW"/>
               </w:rPr>
-              <w:t>尖</w:t>
-            </w:r>
-            <w:proofErr w:type="gramStart"/>
+              <w:t>尖沙咀</w:t>
+            </w:r>
             <w:r>
               <w:rPr>
                 <w:rFonts w:ascii="Arial" w:eastAsia="Microsoft JhengHei" w:hAnsi="Arial"/>
                 <w:sz w:val="18"/>
                 <w:lang w:eastAsia="zh-TW"/>
               </w:rPr>
-              <w:t>沙咀</w:t>
+              <w:t>·</w:t>
             </w:r>
             <w:r>
               <w:rPr>
@@ -1786,27 +1342,16 @@
                 <w:sz w:val="18"/>
                 <w:lang w:eastAsia="zh-TW"/>
               </w:rPr>
+              <w:t>皮膚美容</w:t>
+            </w:r>
+            <w:r>
+              <w:rPr>
+                <w:rFonts w:ascii="Arial" w:eastAsia="Microsoft JhengHei" w:hAnsi="Arial"/>
+                <w:sz w:val="18"/>
+                <w:lang w:eastAsia="zh-TW"/>
+              </w:rPr>
               <w:t>·</w:t>
             </w:r>
-            <w:proofErr w:type="gramEnd"/>
-            <w:r>
-              <w:rPr>
-                <w:rFonts w:ascii="Arial" w:eastAsia="Microsoft JhengHei" w:hAnsi="Arial"/>
-                <w:sz w:val="18"/>
-                <w:lang w:eastAsia="zh-TW"/>
-              </w:rPr>
-              <w:t>皮膚美容</w:t>
-            </w:r>
-            <w:proofErr w:type="gramStart"/>
-            <w:r>
-              <w:rPr>
-                <w:rFonts w:ascii="Arial" w:eastAsia="Microsoft JhengHei" w:hAnsi="Arial"/>
-                <w:sz w:val="18"/>
-                <w:lang w:eastAsia="zh-TW"/>
-              </w:rPr>
-              <w:t>·</w:t>
-            </w:r>
-            <w:proofErr w:type="gramEnd"/>
             <w:r>
               <w:rPr>
                 <w:rFonts w:ascii="Arial" w:eastAsia="Microsoft JhengHei" w:hAnsi="Arial"/>
@@ -1932,7 +1477,6 @@
                 <w:lang w:eastAsia="zh-TW"/>
               </w:rPr>
             </w:pPr>
-            <w:proofErr w:type="gramStart"/>
             <w:r>
               <w:rPr>
                 <w:rFonts w:ascii="Arial" w:eastAsia="Microsoft JhengHei" w:hAnsi="Arial"/>
@@ -1949,7 +1493,6 @@
               </w:rPr>
               <w:t>·</w:t>
             </w:r>
-            <w:proofErr w:type="gramEnd"/>
             <w:r>
               <w:rPr>
                 <w:rFonts w:ascii="Arial" w:eastAsia="Microsoft JhengHei" w:hAnsi="Arial"/>
@@ -1958,7 +1501,6 @@
               </w:rPr>
               <w:t>墨藍</w:t>
             </w:r>
-            <w:proofErr w:type="gramStart"/>
             <w:r>
               <w:rPr>
                 <w:rFonts w:ascii="Arial" w:eastAsia="Microsoft JhengHei" w:hAnsi="Arial"/>
@@ -1967,7 +1509,6 @@
               </w:rPr>
               <w:t>·</w:t>
             </w:r>
-            <w:proofErr w:type="gramEnd"/>
             <w:r>
               <w:rPr>
                 <w:rFonts w:ascii="Arial" w:eastAsia="Microsoft JhengHei" w:hAnsi="Arial"/>
@@ -2452,23 +1993,13 @@
                 <w:lang w:eastAsia="zh-TW"/>
               </w:rPr>
             </w:pPr>
-            <w:proofErr w:type="gramStart"/>
             <w:r>
               <w:rPr>
                 <w:rFonts w:ascii="Arial" w:eastAsia="Microsoft JhengHei" w:hAnsi="Arial"/>
                 <w:sz w:val="18"/>
                 <w:lang w:eastAsia="zh-TW"/>
               </w:rPr>
-              <w:t>霧藍宣紙</w:t>
-            </w:r>
-            <w:proofErr w:type="gramEnd"/>
-            <w:r>
-              <w:rPr>
-                <w:rFonts w:ascii="Arial" w:eastAsia="Microsoft JhengHei" w:hAnsi="Arial"/>
-                <w:sz w:val="18"/>
-                <w:lang w:eastAsia="zh-TW"/>
-              </w:rPr>
-              <w:t>、墨藍文字、留白、高端克制</w:t>
+              <w:t>霧藍宣紙、墨藍文字、留白、高端克制</w:t>
             </w:r>
           </w:p>
         </w:tc>
@@ -2523,18 +2054,8 @@
                 <w:sz w:val="18"/>
                 <w:lang w:eastAsia="zh-TW"/>
               </w:rPr>
-              <w:t>中環上班族、重視專業</w:t>
-            </w:r>
-            <w:proofErr w:type="gramStart"/>
-            <w:r>
-              <w:rPr>
-                <w:rFonts w:ascii="Arial" w:eastAsia="Microsoft JhengHei" w:hAnsi="Arial"/>
-                <w:sz w:val="18"/>
-                <w:lang w:eastAsia="zh-TW"/>
-              </w:rPr>
-              <w:t>與私隱</w:t>
-            </w:r>
-            <w:proofErr w:type="gramEnd"/>
+              <w:t>中環上班族、重視專業與私隱</w:t>
+            </w:r>
           </w:p>
         </w:tc>
       </w:tr>
@@ -2588,25 +2109,7 @@
                 <w:sz w:val="18"/>
                 <w:lang w:eastAsia="zh-TW"/>
               </w:rPr>
-              <w:t>循本溯源、一人一方、合</w:t>
-            </w:r>
-            <w:proofErr w:type="gramStart"/>
-            <w:r>
-              <w:rPr>
-                <w:rFonts w:ascii="Arial" w:eastAsia="Microsoft JhengHei" w:hAnsi="Arial"/>
-                <w:sz w:val="18"/>
-                <w:lang w:eastAsia="zh-TW"/>
-              </w:rPr>
-              <w:t>規</w:t>
-            </w:r>
-            <w:proofErr w:type="gramEnd"/>
-            <w:r>
-              <w:rPr>
-                <w:rFonts w:ascii="Arial" w:eastAsia="Microsoft JhengHei" w:hAnsi="Arial"/>
-                <w:sz w:val="18"/>
-                <w:lang w:eastAsia="zh-TW"/>
-              </w:rPr>
-              <w:t>克制</w:t>
+              <w:t>循本溯源、一人一方、合規克制</w:t>
             </w:r>
           </w:p>
         </w:tc>
@@ -2655,23 +2158,21 @@
                 <w:lang w:eastAsia="zh-TW"/>
               </w:rPr>
             </w:pPr>
-            <w:proofErr w:type="gramStart"/>
             <w:r>
               <w:rPr>
                 <w:rFonts w:ascii="Arial" w:eastAsia="Microsoft JhengHei" w:hAnsi="Arial"/>
                 <w:sz w:val="18"/>
                 <w:lang w:eastAsia="zh-TW"/>
               </w:rPr>
-              <w:t>頤</w:t>
-            </w:r>
-            <w:proofErr w:type="gramEnd"/>
+              <w:t>頤安本草</w:t>
+            </w:r>
             <w:r>
               <w:rPr>
                 <w:rFonts w:ascii="Arial" w:eastAsia="Microsoft JhengHei" w:hAnsi="Arial"/>
                 <w:sz w:val="18"/>
                 <w:lang w:eastAsia="zh-TW"/>
               </w:rPr>
-              <w:t>安本草</w:t>
+              <w:t xml:space="preserve"> · </w:t>
             </w:r>
             <w:r>
               <w:rPr>
@@ -2679,51 +2180,7 @@
                 <w:sz w:val="18"/>
                 <w:lang w:eastAsia="zh-TW"/>
               </w:rPr>
-              <w:t xml:space="preserve"> </w:t>
-            </w:r>
-            <w:proofErr w:type="gramStart"/>
-            <w:r>
-              <w:rPr>
-                <w:rFonts w:ascii="Arial" w:eastAsia="Microsoft JhengHei" w:hAnsi="Arial"/>
-                <w:sz w:val="18"/>
-                <w:lang w:eastAsia="zh-TW"/>
-              </w:rPr>
-              <w:t>·</w:t>
-            </w:r>
-            <w:proofErr w:type="gramEnd"/>
-            <w:r>
-              <w:rPr>
-                <w:rFonts w:ascii="Arial" w:eastAsia="Microsoft JhengHei" w:hAnsi="Arial"/>
-                <w:sz w:val="18"/>
-                <w:lang w:eastAsia="zh-TW"/>
-              </w:rPr>
-              <w:t xml:space="preserve"> </w:t>
-            </w:r>
-            <w:r>
-              <w:rPr>
-                <w:rFonts w:ascii="Arial" w:eastAsia="Microsoft JhengHei" w:hAnsi="Arial"/>
-                <w:sz w:val="18"/>
-                <w:lang w:eastAsia="zh-TW"/>
-              </w:rPr>
-              <w:t>伍厚</w:t>
-            </w:r>
-            <w:proofErr w:type="gramStart"/>
-            <w:r>
-              <w:rPr>
-                <w:rFonts w:ascii="Arial" w:eastAsia="Microsoft JhengHei" w:hAnsi="Arial"/>
-                <w:sz w:val="18"/>
-                <w:lang w:eastAsia="zh-TW"/>
-              </w:rPr>
-              <w:t>臻</w:t>
-            </w:r>
-            <w:proofErr w:type="gramEnd"/>
-            <w:r>
-              <w:rPr>
-                <w:rFonts w:ascii="Arial" w:eastAsia="Microsoft JhengHei" w:hAnsi="Arial"/>
-                <w:sz w:val="18"/>
-                <w:lang w:eastAsia="zh-TW"/>
-              </w:rPr>
-              <w:t>中醫師</w:t>
+              <w:t>伍厚臻中醫師</w:t>
             </w:r>
           </w:p>
         </w:tc>
@@ -2740,6 +2197,18 @@
       <w:pPr>
         <w:spacing w:before="280" w:after="120"/>
         <w:rPr>
+          <w:rFonts w:ascii="Arial" w:eastAsia="宋体" w:hAnsi="Arial"/>
+          <w:b/>
+          <w:color w:val="2A463C"/>
+          <w:sz w:val="28"/>
+          <w:lang w:eastAsia="zh-CN"/>
+        </w:rPr>
+      </w:pPr>
+    </w:p>
+    <w:p>
+      <w:pPr>
+        <w:spacing w:before="280" w:after="120"/>
+        <w:rPr>
           <w:lang w:eastAsia="zh-TW"/>
         </w:rPr>
       </w:pPr>
@@ -2770,7 +2239,6 @@
         </w:rPr>
         <w:t xml:space="preserve">2.1 </w:t>
       </w:r>
-      <w:proofErr w:type="gramStart"/>
       <w:r>
         <w:rPr>
           <w:rFonts w:ascii="Arial" w:eastAsia="Microsoft JhengHei" w:hAnsi="Arial"/>
@@ -2778,17 +2246,7 @@
           <w:sz w:val="23"/>
           <w:lang w:eastAsia="zh-TW"/>
         </w:rPr>
-        <w:t>新官網是</w:t>
-      </w:r>
-      <w:proofErr w:type="gramEnd"/>
-      <w:r>
-        <w:rPr>
-          <w:rFonts w:ascii="Arial" w:eastAsia="Microsoft JhengHei" w:hAnsi="Arial"/>
-          <w:b/>
-          <w:sz w:val="23"/>
-          <w:lang w:eastAsia="zh-TW"/>
-        </w:rPr>
-        <w:t>什麼</w:t>
+        <w:t>新官網是什麼</w:t>
       </w:r>
     </w:p>
     <w:p>
@@ -2804,61 +2262,7 @@
           <w:sz w:val="21"/>
           <w:lang w:eastAsia="zh-TW"/>
         </w:rPr>
-        <w:t>一套為</w:t>
-      </w:r>
-      <w:proofErr w:type="gramStart"/>
-      <w:r>
-        <w:rPr>
-          <w:rFonts w:ascii="Arial" w:eastAsia="Microsoft JhengHei" w:hAnsi="Arial"/>
-          <w:sz w:val="21"/>
-          <w:lang w:eastAsia="zh-TW"/>
-        </w:rPr>
-        <w:t>頤</w:t>
-      </w:r>
-      <w:proofErr w:type="gramEnd"/>
-      <w:r>
-        <w:rPr>
-          <w:rFonts w:ascii="Arial" w:eastAsia="Microsoft JhengHei" w:hAnsi="Arial"/>
-          <w:sz w:val="21"/>
-          <w:lang w:eastAsia="zh-TW"/>
-        </w:rPr>
-        <w:t>安</w:t>
-      </w:r>
-      <w:proofErr w:type="gramStart"/>
-      <w:r>
-        <w:rPr>
-          <w:rFonts w:ascii="Arial" w:eastAsia="Microsoft JhengHei" w:hAnsi="Arial"/>
-          <w:sz w:val="21"/>
-          <w:lang w:eastAsia="zh-TW"/>
-        </w:rPr>
-        <w:t>本草度身</w:t>
-      </w:r>
-      <w:proofErr w:type="gramEnd"/>
-      <w:r>
-        <w:rPr>
-          <w:rFonts w:ascii="Arial" w:eastAsia="Microsoft JhengHei" w:hAnsi="Arial"/>
-          <w:sz w:val="21"/>
-          <w:lang w:eastAsia="zh-TW"/>
-        </w:rPr>
-        <w:t>訂做的</w:t>
-      </w:r>
-      <w:proofErr w:type="gramStart"/>
-      <w:r>
-        <w:rPr>
-          <w:rFonts w:ascii="Arial" w:eastAsia="Microsoft JhengHei" w:hAnsi="Arial"/>
-          <w:sz w:val="21"/>
-          <w:lang w:eastAsia="zh-TW"/>
-        </w:rPr>
-        <w:t>診所官網</w:t>
-      </w:r>
-      <w:proofErr w:type="gramEnd"/>
-      <w:r>
-        <w:rPr>
-          <w:rFonts w:ascii="Arial" w:eastAsia="Microsoft JhengHei" w:hAnsi="Arial"/>
-          <w:sz w:val="21"/>
-          <w:lang w:eastAsia="zh-TW"/>
-        </w:rPr>
-        <w:t>：手機與電腦均可流暢瀏覽，中文為主、並設完整英文版，方便外籍客人。網站已建置完成並上線預覽，待正式網域</w:t>
+        <w:t>一套為頤安本草度身訂做的診所官網：手機與電腦均可流暢瀏覽，中文為主、並設完整英文版，方便外籍客人。網站已建置完成並上線預覽，待正式網域</w:t>
       </w:r>
       <w:r>
         <w:rPr>
@@ -2881,21 +2285,10 @@
       <w:pPr>
         <w:spacing w:before="200" w:after="80"/>
         <w:rPr>
-          <w:rFonts w:ascii="Arial" w:eastAsia="宋体" w:hAnsi="Arial"/>
+          <w:rFonts w:ascii="Arial" w:eastAsia="宋体" w:hAnsi="Arial" w:hint="eastAsia"/>
           <w:b/>
           <w:sz w:val="23"/>
-          <w:lang w:eastAsia="zh-TW"/>
-        </w:rPr>
-      </w:pPr>
-    </w:p>
-    <w:p>
-      <w:pPr>
-        <w:spacing w:before="200" w:after="80"/>
-        <w:rPr>
-          <w:rFonts w:ascii="Arial" w:eastAsia="宋体" w:hAnsi="Arial"/>
-          <w:b/>
-          <w:sz w:val="23"/>
-          <w:lang w:eastAsia="zh-TW"/>
+          <w:lang w:eastAsia="zh-CN"/>
         </w:rPr>
       </w:pPr>
     </w:p>
@@ -3005,25 +2398,7 @@
                 <w:sz w:val="18"/>
                 <w:lang w:eastAsia="zh-TW"/>
               </w:rPr>
-              <w:t>診所介紹、四大專科、診所照片、客人評價、</w:t>
-            </w:r>
-            <w:proofErr w:type="gramStart"/>
-            <w:r>
-              <w:rPr>
-                <w:rFonts w:ascii="Arial" w:eastAsia="Microsoft JhengHei" w:hAnsi="Arial"/>
-                <w:sz w:val="18"/>
-                <w:lang w:eastAsia="zh-TW"/>
-              </w:rPr>
-              <w:t>診金試</w:t>
-            </w:r>
-            <w:proofErr w:type="gramEnd"/>
-            <w:r>
-              <w:rPr>
-                <w:rFonts w:ascii="Arial" w:eastAsia="Microsoft JhengHei" w:hAnsi="Arial"/>
-                <w:sz w:val="18"/>
-                <w:lang w:eastAsia="zh-TW"/>
-              </w:rPr>
-              <w:t>算</w:t>
+              <w:t>診所介紹、四大專科、診所照片、客人評價、診金試算</w:t>
             </w:r>
           </w:p>
         </w:tc>
@@ -3058,41 +2433,13 @@
                 <w:lang w:eastAsia="zh-TW"/>
               </w:rPr>
             </w:pPr>
-            <w:proofErr w:type="gramStart"/>
             <w:r>
               <w:rPr>
                 <w:rFonts w:ascii="Arial" w:eastAsia="Microsoft JhengHei" w:hAnsi="Arial"/>
                 <w:sz w:val="18"/>
                 <w:lang w:eastAsia="zh-TW"/>
               </w:rPr>
-              <w:t>痛症</w:t>
-            </w:r>
-            <w:proofErr w:type="gramEnd"/>
-            <w:r>
-              <w:rPr>
-                <w:rFonts w:ascii="Arial" w:eastAsia="Microsoft JhengHei" w:hAnsi="Arial"/>
-                <w:sz w:val="18"/>
-                <w:lang w:eastAsia="zh-TW"/>
-              </w:rPr>
-              <w:t>、皮膚、婦科、內科；針灸、中藥、艾</w:t>
-            </w:r>
-            <w:proofErr w:type="gramStart"/>
-            <w:r>
-              <w:rPr>
-                <w:rFonts w:ascii="Arial" w:eastAsia="Microsoft JhengHei" w:hAnsi="Arial"/>
-                <w:sz w:val="18"/>
-                <w:lang w:eastAsia="zh-TW"/>
-              </w:rPr>
-              <w:t>灸</w:t>
-            </w:r>
-            <w:proofErr w:type="gramEnd"/>
-            <w:r>
-              <w:rPr>
-                <w:rFonts w:ascii="Arial" w:eastAsia="Microsoft JhengHei" w:hAnsi="Arial"/>
-                <w:sz w:val="18"/>
-                <w:lang w:eastAsia="zh-TW"/>
-              </w:rPr>
-              <w:t>、拔罐等</w:t>
+              <w:t>痛症、皮膚、婦科、內科；針灸、中藥、艾灸、拔罐等</w:t>
             </w:r>
           </w:p>
         </w:tc>
@@ -3133,25 +2480,7 @@
                 <w:sz w:val="18"/>
                 <w:lang w:eastAsia="zh-TW"/>
               </w:rPr>
-              <w:t>濕疹、暗瘡、失眠、</w:t>
-            </w:r>
-            <w:proofErr w:type="gramStart"/>
-            <w:r>
-              <w:rPr>
-                <w:rFonts w:ascii="Arial" w:eastAsia="Microsoft JhengHei" w:hAnsi="Arial"/>
-                <w:sz w:val="18"/>
-                <w:lang w:eastAsia="zh-TW"/>
-              </w:rPr>
-              <w:t>備孕、頸痛</w:t>
-            </w:r>
-            <w:proofErr w:type="gramEnd"/>
-            <w:r>
-              <w:rPr>
-                <w:rFonts w:ascii="Arial" w:eastAsia="Microsoft JhengHei" w:hAnsi="Arial"/>
-                <w:sz w:val="18"/>
-                <w:lang w:eastAsia="zh-TW"/>
-              </w:rPr>
-              <w:t>、坐骨神經痛等專頁</w:t>
+              <w:t>濕疹、暗瘡、失眠、備孕、頸痛、坐骨神經痛等專頁</w:t>
             </w:r>
           </w:p>
         </w:tc>
@@ -3413,25 +2742,7 @@
           <w:sz w:val="20"/>
           <w:lang w:eastAsia="zh-TW"/>
         </w:rPr>
-        <w:t>，並附標準問候語，方便客人</w:t>
-      </w:r>
-      <w:proofErr w:type="gramStart"/>
-      <w:r>
-        <w:rPr>
-          <w:rFonts w:ascii="Arial" w:eastAsia="Microsoft JhengHei" w:hAnsi="Arial"/>
-          <w:sz w:val="20"/>
-          <w:lang w:eastAsia="zh-TW"/>
-        </w:rPr>
-        <w:t>一</w:t>
-      </w:r>
-      <w:proofErr w:type="gramEnd"/>
-      <w:r>
-        <w:rPr>
-          <w:rFonts w:ascii="Arial" w:eastAsia="Microsoft JhengHei" w:hAnsi="Arial"/>
-          <w:sz w:val="20"/>
-          <w:lang w:eastAsia="zh-TW"/>
-        </w:rPr>
-        <w:t>鍵開啟對話</w:t>
+        <w:t>，並附標準問候語，方便客人一鍵開啟對話</w:t>
       </w:r>
     </w:p>
     <w:p>
@@ -3457,41 +2768,13 @@
           <w:lang w:eastAsia="zh-TW"/>
         </w:rPr>
       </w:pPr>
-      <w:proofErr w:type="gramStart"/>
       <w:r>
         <w:rPr>
           <w:rFonts w:ascii="Arial" w:eastAsia="Microsoft JhengHei" w:hAnsi="Arial"/>
           <w:sz w:val="20"/>
           <w:lang w:eastAsia="zh-TW"/>
         </w:rPr>
-        <w:t>診金計算器</w:t>
-      </w:r>
-      <w:proofErr w:type="gramEnd"/>
-      <w:r>
-        <w:rPr>
-          <w:rFonts w:ascii="Arial" w:eastAsia="Microsoft JhengHei" w:hAnsi="Arial"/>
-          <w:sz w:val="20"/>
-          <w:lang w:eastAsia="zh-TW"/>
-        </w:rPr>
-        <w:t>：客人可自行試算，並</w:t>
-      </w:r>
-      <w:proofErr w:type="gramStart"/>
-      <w:r>
-        <w:rPr>
-          <w:rFonts w:ascii="Arial" w:eastAsia="Microsoft JhengHei" w:hAnsi="Arial"/>
-          <w:sz w:val="20"/>
-          <w:lang w:eastAsia="zh-TW"/>
-        </w:rPr>
-        <w:t>一</w:t>
-      </w:r>
-      <w:proofErr w:type="gramEnd"/>
-      <w:r>
-        <w:rPr>
-          <w:rFonts w:ascii="Arial" w:eastAsia="Microsoft JhengHei" w:hAnsi="Arial"/>
-          <w:sz w:val="20"/>
-          <w:lang w:eastAsia="zh-TW"/>
-        </w:rPr>
-        <w:t>鍵帶入預約</w:t>
+        <w:t>診金計算器：客人可自行試算，並一鍵帶入預約</w:t>
       </w:r>
     </w:p>
     <w:p>
@@ -3740,25 +3023,7 @@
           <w:sz w:val="20"/>
           <w:lang w:eastAsia="zh-TW"/>
         </w:rPr>
-        <w:t>評價（附合</w:t>
-      </w:r>
-      <w:proofErr w:type="gramStart"/>
-      <w:r>
-        <w:rPr>
-          <w:rFonts w:ascii="Arial" w:eastAsia="Microsoft JhengHei" w:hAnsi="Arial"/>
-          <w:sz w:val="20"/>
-          <w:lang w:eastAsia="zh-TW"/>
-        </w:rPr>
-        <w:t>規</w:t>
-      </w:r>
-      <w:proofErr w:type="gramEnd"/>
-      <w:r>
-        <w:rPr>
-          <w:rFonts w:ascii="Arial" w:eastAsia="Microsoft JhengHei" w:hAnsi="Arial"/>
-          <w:sz w:val="20"/>
-          <w:lang w:eastAsia="zh-TW"/>
-        </w:rPr>
-        <w:t>免責說明）</w:t>
+        <w:t>評價（附合規免責說明）</w:t>
       </w:r>
     </w:p>
     <w:p>
@@ -3820,43 +3085,7 @@
           <w:sz w:val="20"/>
           <w:lang w:eastAsia="zh-TW"/>
         </w:rPr>
-        <w:t>文案遵守合</w:t>
-      </w:r>
-      <w:proofErr w:type="gramStart"/>
-      <w:r>
-        <w:rPr>
-          <w:rFonts w:ascii="Arial" w:eastAsia="Microsoft JhengHei" w:hAnsi="Arial"/>
-          <w:sz w:val="20"/>
-          <w:lang w:eastAsia="zh-TW"/>
-        </w:rPr>
-        <w:t>規</w:t>
-      </w:r>
-      <w:proofErr w:type="gramEnd"/>
-      <w:r>
-        <w:rPr>
-          <w:rFonts w:ascii="Arial" w:eastAsia="Microsoft JhengHei" w:hAnsi="Arial"/>
-          <w:sz w:val="20"/>
-          <w:lang w:eastAsia="zh-TW"/>
-        </w:rPr>
-        <w:t>：不承諾「根治」「數</w:t>
-      </w:r>
-      <w:proofErr w:type="gramStart"/>
-      <w:r>
-        <w:rPr>
-          <w:rFonts w:ascii="Arial" w:eastAsia="Microsoft JhengHei" w:hAnsi="Arial"/>
-          <w:sz w:val="20"/>
-          <w:lang w:eastAsia="zh-TW"/>
-        </w:rPr>
-        <w:t>週</w:t>
-      </w:r>
-      <w:proofErr w:type="gramEnd"/>
-      <w:r>
-        <w:rPr>
-          <w:rFonts w:ascii="Arial" w:eastAsia="Microsoft JhengHei" w:hAnsi="Arial"/>
-          <w:sz w:val="20"/>
-          <w:lang w:eastAsia="zh-TW"/>
-        </w:rPr>
-        <w:t>見效」等表述</w:t>
+        <w:t>文案遵守合規：不承諾「根治」「數週見效」等表述</w:t>
       </w:r>
     </w:p>
     <w:p>
@@ -3866,7 +3095,7 @@
           <w:rFonts w:ascii="Arial" w:eastAsia="宋体" w:hAnsi="Arial"/>
           <w:b/>
           <w:sz w:val="23"/>
-          <w:lang w:eastAsia="zh-CN"/>
+          <w:lang w:eastAsia="zh-TW"/>
         </w:rPr>
       </w:pPr>
     </w:p>
@@ -3877,7 +3106,7 @@
           <w:rFonts w:ascii="Arial" w:eastAsia="宋体" w:hAnsi="Arial"/>
           <w:b/>
           <w:sz w:val="23"/>
-          <w:lang w:eastAsia="zh-CN"/>
+          <w:lang w:eastAsia="zh-TW"/>
         </w:rPr>
       </w:pPr>
     </w:p>
@@ -3921,149 +3150,23 @@
           <w:sz w:val="21"/>
           <w:lang w:eastAsia="zh-TW"/>
         </w:rPr>
-        <w:t>整體定調為「湖水晨霧宣紙」的</w:t>
-      </w:r>
-      <w:proofErr w:type="gramStart"/>
+        <w:t>整體定調為「湖水晨霧宣紙」的東方雅韻：偏冷、偏霧藍灰的紙感背景，搭配深墨藍文字與適度留白，營造中環高端、寧靜、專業的診所印象</w:t>
+      </w:r>
       <w:r>
         <w:rPr>
           <w:rFonts w:ascii="Arial" w:eastAsia="Microsoft JhengHei" w:hAnsi="Arial"/>
           <w:sz w:val="21"/>
           <w:lang w:eastAsia="zh-TW"/>
         </w:rPr>
-        <w:t>東方雅</w:t>
-      </w:r>
-      <w:proofErr w:type="gramEnd"/>
+        <w:t>——</w:t>
+      </w:r>
       <w:r>
         <w:rPr>
           <w:rFonts w:ascii="Arial" w:eastAsia="Microsoft JhengHei" w:hAnsi="Arial"/>
           <w:sz w:val="21"/>
           <w:lang w:eastAsia="zh-TW"/>
         </w:rPr>
-        <w:t>韻：偏冷、</w:t>
-      </w:r>
-      <w:proofErr w:type="gramStart"/>
-      <w:r>
-        <w:rPr>
-          <w:rFonts w:ascii="Arial" w:eastAsia="Microsoft JhengHei" w:hAnsi="Arial"/>
-          <w:sz w:val="21"/>
-          <w:lang w:eastAsia="zh-TW"/>
-        </w:rPr>
-        <w:t>偏霧藍</w:t>
-      </w:r>
-      <w:proofErr w:type="gramEnd"/>
-      <w:r>
-        <w:rPr>
-          <w:rFonts w:ascii="Arial" w:eastAsia="Microsoft JhengHei" w:hAnsi="Arial"/>
-          <w:sz w:val="21"/>
-          <w:lang w:eastAsia="zh-TW"/>
-        </w:rPr>
-        <w:t>灰</w:t>
-      </w:r>
-      <w:proofErr w:type="gramStart"/>
-      <w:r>
-        <w:rPr>
-          <w:rFonts w:ascii="Arial" w:eastAsia="Microsoft JhengHei" w:hAnsi="Arial"/>
-          <w:sz w:val="21"/>
-          <w:lang w:eastAsia="zh-TW"/>
-        </w:rPr>
-        <w:t>的紙感背景</w:t>
-      </w:r>
-      <w:proofErr w:type="gramEnd"/>
-      <w:r>
-        <w:rPr>
-          <w:rFonts w:ascii="Arial" w:eastAsia="Microsoft JhengHei" w:hAnsi="Arial"/>
-          <w:sz w:val="21"/>
-          <w:lang w:eastAsia="zh-TW"/>
-        </w:rPr>
-        <w:t>，</w:t>
-      </w:r>
-      <w:proofErr w:type="gramStart"/>
-      <w:r>
-        <w:rPr>
-          <w:rFonts w:ascii="Arial" w:eastAsia="Microsoft JhengHei" w:hAnsi="Arial"/>
-          <w:sz w:val="21"/>
-          <w:lang w:eastAsia="zh-TW"/>
-        </w:rPr>
-        <w:t>搭配深墨藍</w:t>
-      </w:r>
-      <w:proofErr w:type="gramEnd"/>
-      <w:r>
-        <w:rPr>
-          <w:rFonts w:ascii="Arial" w:eastAsia="Microsoft JhengHei" w:hAnsi="Arial"/>
-          <w:sz w:val="21"/>
-          <w:lang w:eastAsia="zh-TW"/>
-        </w:rPr>
-        <w:t>文字與適度留白，營造</w:t>
-      </w:r>
-      <w:proofErr w:type="gramStart"/>
-      <w:r>
-        <w:rPr>
-          <w:rFonts w:ascii="Arial" w:eastAsia="Microsoft JhengHei" w:hAnsi="Arial"/>
-          <w:sz w:val="21"/>
-          <w:lang w:eastAsia="zh-TW"/>
-        </w:rPr>
-        <w:t>中環高端</w:t>
-      </w:r>
-      <w:proofErr w:type="gramEnd"/>
-      <w:r>
-        <w:rPr>
-          <w:rFonts w:ascii="Arial" w:eastAsia="Microsoft JhengHei" w:hAnsi="Arial"/>
-          <w:sz w:val="21"/>
-          <w:lang w:eastAsia="zh-TW"/>
-        </w:rPr>
-        <w:t>、寧靜、專業的診所印象</w:t>
-      </w:r>
-      <w:r>
-        <w:rPr>
-          <w:rFonts w:ascii="Arial" w:eastAsia="Microsoft JhengHei" w:hAnsi="Arial"/>
-          <w:sz w:val="21"/>
-          <w:lang w:eastAsia="zh-TW"/>
-        </w:rPr>
-        <w:t>——</w:t>
-      </w:r>
-      <w:r>
-        <w:rPr>
-          <w:rFonts w:ascii="Arial" w:eastAsia="Microsoft JhengHei" w:hAnsi="Arial"/>
-          <w:sz w:val="21"/>
-          <w:lang w:eastAsia="zh-TW"/>
-        </w:rPr>
-        <w:t>刻意</w:t>
-      </w:r>
-      <w:proofErr w:type="gramStart"/>
-      <w:r>
-        <w:rPr>
-          <w:rFonts w:ascii="Arial" w:eastAsia="Microsoft JhengHei" w:hAnsi="Arial"/>
-          <w:sz w:val="21"/>
-          <w:lang w:eastAsia="zh-TW"/>
-        </w:rPr>
-        <w:t>與養康的</w:t>
-      </w:r>
-      <w:proofErr w:type="gramEnd"/>
-      <w:r>
-        <w:rPr>
-          <w:rFonts w:ascii="Arial" w:eastAsia="Microsoft JhengHei" w:hAnsi="Arial"/>
-          <w:sz w:val="21"/>
-          <w:lang w:eastAsia="zh-TW"/>
-        </w:rPr>
-        <w:t>綠色臨床</w:t>
-      </w:r>
-      <w:proofErr w:type="gramStart"/>
-      <w:r>
-        <w:rPr>
-          <w:rFonts w:ascii="Arial" w:eastAsia="Microsoft JhengHei" w:hAnsi="Arial"/>
-          <w:sz w:val="21"/>
-          <w:lang w:eastAsia="zh-TW"/>
-        </w:rPr>
-        <w:t>促銷感區隔</w:t>
-      </w:r>
-      <w:proofErr w:type="gramEnd"/>
-      <w:r>
-        <w:rPr>
-          <w:rFonts w:ascii="Arial" w:eastAsia="Microsoft JhengHei" w:hAnsi="Arial"/>
-          <w:sz w:val="21"/>
-          <w:lang w:eastAsia="zh-TW"/>
-        </w:rPr>
-        <w:t>。</w:t>
+        <w:t>刻意與養康的綠色臨床促銷感區隔。</w:t>
       </w:r>
     </w:p>
     <w:p>
@@ -4174,52 +3277,14 @@
                 <w:lang w:eastAsia="zh-TW"/>
               </w:rPr>
             </w:pPr>
-            <w:proofErr w:type="gramStart"/>
             <w:r>
               <w:rPr>
                 <w:rFonts w:ascii="Arial" w:eastAsia="Microsoft JhengHei" w:hAnsi="Arial"/>
                 <w:sz w:val="18"/>
                 <w:lang w:eastAsia="zh-TW"/>
               </w:rPr>
-              <w:t>淡霧藍</w:t>
-            </w:r>
-            <w:proofErr w:type="gramEnd"/>
-            <w:r>
-              <w:rPr>
-                <w:rFonts w:ascii="Arial" w:eastAsia="Microsoft JhengHei" w:hAnsi="Arial"/>
-                <w:sz w:val="18"/>
-                <w:lang w:eastAsia="zh-TW"/>
-              </w:rPr>
-              <w:t>白宣紙，帶</w:t>
-            </w:r>
-            <w:proofErr w:type="gramStart"/>
-            <w:r>
-              <w:rPr>
-                <w:rFonts w:ascii="Arial" w:eastAsia="Microsoft JhengHei" w:hAnsi="Arial"/>
-                <w:sz w:val="18"/>
-                <w:lang w:eastAsia="zh-TW"/>
-              </w:rPr>
-              <w:t>微藍漸</w:t>
-            </w:r>
-            <w:proofErr w:type="gramEnd"/>
-            <w:r>
-              <w:rPr>
-                <w:rFonts w:ascii="Arial" w:eastAsia="Microsoft JhengHei" w:hAnsi="Arial"/>
-                <w:sz w:val="18"/>
-                <w:lang w:eastAsia="zh-TW"/>
-              </w:rPr>
-              <w:t>層與</w:t>
-            </w:r>
-            <w:proofErr w:type="gramStart"/>
-            <w:r>
-              <w:rPr>
-                <w:rFonts w:ascii="Arial" w:eastAsia="Microsoft JhengHei" w:hAnsi="Arial"/>
-                <w:sz w:val="18"/>
-                <w:lang w:eastAsia="zh-TW"/>
-              </w:rPr>
-              <w:t>細緻紙紋</w:t>
-            </w:r>
-            <w:proofErr w:type="gramEnd"/>
+              <w:t>淡霧藍白宣紙，帶微藍漸層與細緻紙紋</w:t>
+            </w:r>
           </w:p>
         </w:tc>
         <w:tc>
@@ -4578,25 +3643,7 @@
           <w:sz w:val="20"/>
           <w:lang w:eastAsia="zh-TW"/>
         </w:rPr>
-        <w:t>印章圖（</w:t>
-      </w:r>
-      <w:proofErr w:type="gramStart"/>
-      <w:r>
-        <w:rPr>
-          <w:rFonts w:ascii="Arial" w:eastAsia="Microsoft JhengHei" w:hAnsi="Arial"/>
-          <w:sz w:val="20"/>
-          <w:lang w:eastAsia="zh-TW"/>
-        </w:rPr>
-        <w:t>頤</w:t>
-      </w:r>
-      <w:proofErr w:type="gramEnd"/>
-      <w:r>
-        <w:rPr>
-          <w:rFonts w:ascii="Arial" w:eastAsia="Microsoft JhengHei" w:hAnsi="Arial"/>
-          <w:sz w:val="20"/>
-          <w:lang w:eastAsia="zh-TW"/>
-        </w:rPr>
-        <w:t>安本草、候診醫師等主題印）</w:t>
+        <w:t>印章圖（頤安本草、候診醫師等主題印）</w:t>
       </w:r>
     </w:p>
     <w:p>
@@ -4696,25 +3743,7 @@
           <w:sz w:val="20"/>
           <w:lang w:eastAsia="zh-TW"/>
         </w:rPr>
-        <w:t>版面：手機優先；導</w:t>
-      </w:r>
-      <w:proofErr w:type="gramStart"/>
-      <w:r>
-        <w:rPr>
-          <w:rFonts w:ascii="Arial" w:eastAsia="Microsoft JhengHei" w:hAnsi="Arial"/>
-          <w:sz w:val="20"/>
-          <w:lang w:eastAsia="zh-TW"/>
-        </w:rPr>
-        <w:t>覽</w:t>
-      </w:r>
-      <w:proofErr w:type="gramEnd"/>
-      <w:r>
-        <w:rPr>
-          <w:rFonts w:ascii="Arial" w:eastAsia="Microsoft JhengHei" w:hAnsi="Arial"/>
-          <w:sz w:val="20"/>
-          <w:lang w:eastAsia="zh-TW"/>
-        </w:rPr>
-        <w:t>、底部預約欄固定，方便隨時聯絡</w:t>
+        <w:t>版面：手機優先；導覽、底部預約欄固定，方便隨時聯絡</w:t>
       </w:r>
     </w:p>
     <w:p>
@@ -4930,23 +3959,13 @@
                 <w:lang w:eastAsia="zh-TW"/>
               </w:rPr>
             </w:pPr>
-            <w:proofErr w:type="gramStart"/>
             <w:r>
               <w:rPr>
                 <w:rFonts w:ascii="Arial" w:eastAsia="Microsoft JhengHei" w:hAnsi="Arial"/>
                 <w:sz w:val="18"/>
                 <w:lang w:eastAsia="zh-TW"/>
               </w:rPr>
-              <w:t>與霧藍宣紙</w:t>
-            </w:r>
-            <w:proofErr w:type="gramEnd"/>
-            <w:r>
-              <w:rPr>
-                <w:rFonts w:ascii="Arial" w:eastAsia="Microsoft JhengHei" w:hAnsi="Arial"/>
-                <w:sz w:val="18"/>
-                <w:lang w:eastAsia="zh-TW"/>
-              </w:rPr>
-              <w:t>底調和；避免高飽和促銷色塊</w:t>
+              <w:t>與霧藍宣紙底調和；避免高飽和促銷色塊</w:t>
             </w:r>
           </w:p>
         </w:tc>
@@ -5262,7 +4281,7 @@
           <w:rFonts w:ascii="Arial" w:eastAsia="宋体" w:hAnsi="Arial"/>
           <w:b/>
           <w:sz w:val="23"/>
-          <w:lang w:eastAsia="zh-CN"/>
+          <w:lang w:eastAsia="zh-TW"/>
         </w:rPr>
       </w:pPr>
     </w:p>
@@ -5283,7 +4302,6 @@
         <w:lastRenderedPageBreak/>
         <w:t xml:space="preserve">2.9 </w:t>
       </w:r>
-      <w:proofErr w:type="gramStart"/>
       <w:r>
         <w:rPr>
           <w:rFonts w:ascii="Arial" w:eastAsia="Microsoft JhengHei" w:hAnsi="Arial"/>
@@ -5293,7 +4311,6 @@
         </w:rPr>
         <w:t>舊官網</w:t>
       </w:r>
-      <w:proofErr w:type="gramEnd"/>
       <w:r>
         <w:rPr>
           <w:rFonts w:ascii="Arial" w:eastAsia="Microsoft JhengHei" w:hAnsi="Arial"/>
@@ -5303,7 +4320,6 @@
         </w:rPr>
         <w:t xml:space="preserve"> → </w:t>
       </w:r>
-      <w:proofErr w:type="gramStart"/>
       <w:r>
         <w:rPr>
           <w:rFonts w:ascii="Arial" w:eastAsia="Microsoft JhengHei" w:hAnsi="Arial"/>
@@ -5311,17 +4327,7 @@
           <w:sz w:val="23"/>
           <w:lang w:eastAsia="zh-TW"/>
         </w:rPr>
-        <w:t>新官網</w:t>
-      </w:r>
-      <w:proofErr w:type="gramEnd"/>
-      <w:r>
-        <w:rPr>
-          <w:rFonts w:ascii="Arial" w:eastAsia="Microsoft JhengHei" w:hAnsi="Arial"/>
-          <w:b/>
-          <w:sz w:val="23"/>
-          <w:lang w:eastAsia="zh-TW"/>
-        </w:rPr>
-        <w:t>（一覽）</w:t>
+        <w:t>新官網（一覽）</w:t>
       </w:r>
     </w:p>
     <w:tbl>
@@ -5562,7 +4568,6 @@
                 <w:lang w:eastAsia="zh-TW"/>
               </w:rPr>
             </w:pPr>
-            <w:proofErr w:type="gramStart"/>
             <w:r>
               <w:rPr>
                 <w:rFonts w:ascii="Arial" w:eastAsia="Microsoft JhengHei" w:hAnsi="Arial"/>
@@ -5571,7 +4576,6 @@
               </w:rPr>
               <w:t>霧藍宣紙</w:t>
             </w:r>
-            <w:proofErr w:type="gramEnd"/>
             <w:r>
               <w:rPr>
                 <w:rFonts w:ascii="Arial" w:eastAsia="Microsoft JhengHei" w:hAnsi="Arial"/>
@@ -5596,7 +4600,6 @@
               </w:rPr>
               <w:t xml:space="preserve"> + </w:t>
             </w:r>
-            <w:proofErr w:type="gramStart"/>
             <w:r>
               <w:rPr>
                 <w:rFonts w:ascii="Arial" w:eastAsia="Microsoft JhengHei" w:hAnsi="Arial"/>
@@ -5605,7 +4608,6 @@
               </w:rPr>
               <w:t>墨藍系</w:t>
             </w:r>
-            <w:proofErr w:type="gramEnd"/>
           </w:p>
         </w:tc>
       </w:tr>
@@ -6068,47 +5070,7 @@
           <w:sz w:val="21"/>
           <w:lang w:eastAsia="zh-TW"/>
         </w:rPr>
-        <w:t>廣告找</w:t>
-      </w:r>
-      <w:proofErr w:type="gramStart"/>
-      <w:r>
-        <w:rPr>
-          <w:rFonts w:ascii="Arial" w:eastAsia="Microsoft JhengHei" w:hAnsi="Arial"/>
-          <w:b/>
-          <w:sz w:val="21"/>
-          <w:lang w:eastAsia="zh-TW"/>
-        </w:rPr>
-        <w:t>準</w:t>
-      </w:r>
-      <w:proofErr w:type="gramEnd"/>
-      <w:r>
-        <w:rPr>
-          <w:rFonts w:ascii="Arial" w:eastAsia="Microsoft JhengHei" w:hAnsi="Arial"/>
-          <w:b/>
-          <w:sz w:val="21"/>
-          <w:lang w:eastAsia="zh-TW"/>
-        </w:rPr>
-        <w:t>客人，把人帶</w:t>
-      </w:r>
-      <w:proofErr w:type="gramStart"/>
-      <w:r>
-        <w:rPr>
-          <w:rFonts w:ascii="Arial" w:eastAsia="Microsoft JhengHei" w:hAnsi="Arial"/>
-          <w:b/>
-          <w:sz w:val="21"/>
-          <w:lang w:eastAsia="zh-TW"/>
-        </w:rPr>
-        <w:t>到官網對應</w:t>
-      </w:r>
-      <w:proofErr w:type="gramEnd"/>
-      <w:r>
-        <w:rPr>
-          <w:rFonts w:ascii="Arial" w:eastAsia="Microsoft JhengHei" w:hAnsi="Arial"/>
-          <w:b/>
-          <w:sz w:val="21"/>
-          <w:lang w:eastAsia="zh-TW"/>
-        </w:rPr>
-        <w:t>的症狀或專科頁，最後統一經</w:t>
+        <w:t>廣告找準客人，把人帶到官網對應的症狀或專科頁，最後統一經</w:t>
       </w:r>
       <w:r>
         <w:rPr>
@@ -6160,23 +5122,13 @@
         </w:rPr>
         <w:t>開始預約對話</w:t>
       </w:r>
-      <w:proofErr w:type="gramStart"/>
       <w:r>
         <w:rPr>
           <w:rFonts w:ascii="Arial" w:eastAsia="Microsoft JhengHei" w:hAnsi="Arial"/>
           <w:sz w:val="21"/>
           <w:lang w:eastAsia="zh-TW"/>
         </w:rPr>
-        <w:t>—</w:t>
-      </w:r>
-      <w:proofErr w:type="gramEnd"/>
-      <w:r>
-        <w:rPr>
-          <w:rFonts w:ascii="Arial" w:eastAsia="Microsoft JhengHei" w:hAnsi="Arial"/>
-          <w:sz w:val="21"/>
-          <w:lang w:eastAsia="zh-TW"/>
-        </w:rPr>
-        <w:t>—</w:t>
+        <w:t>——</w:t>
       </w:r>
       <w:r>
         <w:rPr>
@@ -6918,23 +5870,13 @@
               </w:rPr>
               <w:t xml:space="preserve"> 60 </w:t>
             </w:r>
-            <w:proofErr w:type="gramStart"/>
             <w:r>
               <w:rPr>
                 <w:rFonts w:ascii="Arial" w:eastAsia="Microsoft JhengHei" w:hAnsi="Arial"/>
                 <w:sz w:val="18"/>
                 <w:lang w:eastAsia="zh-TW"/>
               </w:rPr>
-              <w:t>分鐘線上會議</w:t>
-            </w:r>
-            <w:proofErr w:type="gramEnd"/>
-            <w:r>
-              <w:rPr>
-                <w:rFonts w:ascii="Arial" w:eastAsia="Microsoft JhengHei" w:hAnsi="Arial"/>
-                <w:sz w:val="18"/>
-                <w:lang w:eastAsia="zh-TW"/>
-              </w:rPr>
-              <w:t>，檢視成效與下月計劃</w:t>
+              <w:t>分鐘線上會議，檢視成效與下月計劃</w:t>
             </w:r>
           </w:p>
         </w:tc>
@@ -6986,23 +5928,13 @@
         </w:rPr>
         <w:t xml:space="preserve"> 1 </w:t>
       </w:r>
-      <w:proofErr w:type="gramStart"/>
       <w:r>
         <w:rPr>
           <w:rFonts w:ascii="Arial" w:eastAsia="Microsoft JhengHei" w:hAnsi="Arial"/>
           <w:sz w:val="20"/>
           <w:lang w:eastAsia="zh-TW"/>
         </w:rPr>
-        <w:t>週</w:t>
-      </w:r>
-      <w:proofErr w:type="gramEnd"/>
-      <w:r>
-        <w:rPr>
-          <w:rFonts w:ascii="Arial" w:eastAsia="Microsoft JhengHei" w:hAnsi="Arial"/>
-          <w:sz w:val="20"/>
-          <w:lang w:eastAsia="zh-TW"/>
-        </w:rPr>
-        <w:t>：發布症狀科普（例如濕疹與體質的關係）</w:t>
+        <w:t>週：發布症狀科普（例如濕疹與體質的關係）</w:t>
       </w:r>
     </w:p>
     <w:p>
@@ -7028,23 +5960,21 @@
         </w:rPr>
         <w:t xml:space="preserve"> 2 </w:t>
       </w:r>
-      <w:proofErr w:type="gramStart"/>
       <w:r>
         <w:rPr>
           <w:rFonts w:ascii="Arial" w:eastAsia="Microsoft JhengHei" w:hAnsi="Arial"/>
           <w:sz w:val="20"/>
           <w:lang w:eastAsia="zh-TW"/>
         </w:rPr>
-        <w:t>週</w:t>
-      </w:r>
-      <w:proofErr w:type="gramEnd"/>
+        <w:t>週：發布診所信任內容（環境、資歷、評價）</w:t>
+      </w:r>
       <w:r>
         <w:rPr>
           <w:rFonts w:ascii="Arial" w:eastAsia="Microsoft JhengHei" w:hAnsi="Arial"/>
           <w:sz w:val="20"/>
           <w:lang w:eastAsia="zh-TW"/>
         </w:rPr>
-        <w:t>：發布診所信任內容（環境、資歷、評價）</w:t>
+        <w:t xml:space="preserve">+ </w:t>
       </w:r>
       <w:r>
         <w:rPr>
@@ -7052,18 +5982,8 @@
           <w:sz w:val="20"/>
           <w:lang w:eastAsia="zh-TW"/>
         </w:rPr>
-        <w:t xml:space="preserve">+ </w:t>
-      </w:r>
-      <w:proofErr w:type="gramStart"/>
-      <w:r>
-        <w:rPr>
-          <w:rFonts w:ascii="Arial" w:eastAsia="Microsoft JhengHei" w:hAnsi="Arial"/>
-          <w:sz w:val="20"/>
-          <w:lang w:eastAsia="zh-TW"/>
-        </w:rPr>
         <w:t>官網第</w:t>
       </w:r>
-      <w:proofErr w:type="gramEnd"/>
       <w:r>
         <w:rPr>
           <w:rFonts w:ascii="Arial" w:eastAsia="Microsoft JhengHei" w:hAnsi="Arial"/>
@@ -7104,23 +6024,13 @@
         </w:rPr>
         <w:t xml:space="preserve"> 3 </w:t>
       </w:r>
-      <w:proofErr w:type="gramStart"/>
       <w:r>
         <w:rPr>
           <w:rFonts w:ascii="Arial" w:eastAsia="Microsoft JhengHei" w:hAnsi="Arial"/>
           <w:sz w:val="20"/>
           <w:lang w:eastAsia="zh-TW"/>
         </w:rPr>
-        <w:t>週</w:t>
-      </w:r>
-      <w:proofErr w:type="gramEnd"/>
-      <w:r>
-        <w:rPr>
-          <w:rFonts w:ascii="Arial" w:eastAsia="Microsoft JhengHei" w:hAnsi="Arial"/>
-          <w:sz w:val="20"/>
-          <w:lang w:eastAsia="zh-TW"/>
-        </w:rPr>
-        <w:t>：季節養生主題</w:t>
+        <w:t>週：季節養生主題</w:t>
       </w:r>
       <w:r>
         <w:rPr>
@@ -7162,23 +6072,21 @@
         </w:rPr>
         <w:t xml:space="preserve"> 4 </w:t>
       </w:r>
-      <w:proofErr w:type="gramStart"/>
       <w:r>
         <w:rPr>
           <w:rFonts w:ascii="Arial" w:eastAsia="Microsoft JhengHei" w:hAnsi="Arial"/>
           <w:sz w:val="20"/>
           <w:lang w:eastAsia="zh-TW"/>
         </w:rPr>
-        <w:t>週</w:t>
-      </w:r>
-      <w:proofErr w:type="gramEnd"/>
+        <w:t>週：教客人如何</w:t>
+      </w:r>
       <w:r>
         <w:rPr>
           <w:rFonts w:ascii="Arial" w:eastAsia="Microsoft JhengHei" w:hAnsi="Arial"/>
           <w:sz w:val="20"/>
           <w:lang w:eastAsia="zh-TW"/>
         </w:rPr>
-        <w:t>：教客人如何</w:t>
+        <w:t xml:space="preserve"> WhatsApp </w:t>
       </w:r>
       <w:r>
         <w:rPr>
@@ -7186,7 +6094,7 @@
           <w:sz w:val="20"/>
           <w:lang w:eastAsia="zh-TW"/>
         </w:rPr>
-        <w:t xml:space="preserve"> WhatsApp </w:t>
+        <w:t>預約</w:t>
       </w:r>
       <w:r>
         <w:rPr>
@@ -7194,7 +6102,7 @@
           <w:sz w:val="20"/>
           <w:lang w:eastAsia="zh-TW"/>
         </w:rPr>
-        <w:t>預約</w:t>
+        <w:t xml:space="preserve"> + </w:t>
       </w:r>
       <w:r>
         <w:rPr>
@@ -7202,18 +6110,8 @@
           <w:sz w:val="20"/>
           <w:lang w:eastAsia="zh-TW"/>
         </w:rPr>
-        <w:t xml:space="preserve"> + </w:t>
-      </w:r>
-      <w:proofErr w:type="gramStart"/>
-      <w:r>
-        <w:rPr>
-          <w:rFonts w:ascii="Arial" w:eastAsia="Microsoft JhengHei" w:hAnsi="Arial"/>
-          <w:sz w:val="20"/>
-          <w:lang w:eastAsia="zh-TW"/>
-        </w:rPr>
         <w:t>官網第</w:t>
       </w:r>
-      <w:proofErr w:type="gramEnd"/>
       <w:r>
         <w:rPr>
           <w:rFonts w:ascii="Arial" w:eastAsia="Microsoft JhengHei" w:hAnsi="Arial"/>
@@ -7693,25 +6591,7 @@
           <w:sz w:val="20"/>
           <w:lang w:eastAsia="zh-TW"/>
         </w:rPr>
-        <w:t>；代為設定與優化廣告已包含</w:t>
-      </w:r>
-      <w:proofErr w:type="gramStart"/>
-      <w:r>
-        <w:rPr>
-          <w:rFonts w:ascii="Arial" w:eastAsia="Microsoft JhengHei" w:hAnsi="Arial"/>
-          <w:sz w:val="20"/>
-          <w:lang w:eastAsia="zh-TW"/>
-        </w:rPr>
-        <w:t>在月度服務</w:t>
-      </w:r>
-      <w:proofErr w:type="gramEnd"/>
-      <w:r>
-        <w:rPr>
-          <w:rFonts w:ascii="Arial" w:eastAsia="Microsoft JhengHei" w:hAnsi="Arial"/>
-          <w:sz w:val="20"/>
-          <w:lang w:eastAsia="zh-TW"/>
-        </w:rPr>
-        <w:t>內（詳見報價單）。</w:t>
+        <w:t>；代為設定與優化廣告已包含在月度服務內（詳見報價單）。</w:t>
       </w:r>
       <w:proofErr w:type="spellStart"/>
       <w:r>
@@ -7818,23 +6698,13 @@
           <w:lang w:eastAsia="zh-TW"/>
         </w:rPr>
       </w:pPr>
-      <w:proofErr w:type="gramStart"/>
       <w:r>
         <w:rPr>
           <w:rFonts w:ascii="Arial" w:eastAsia="Microsoft JhengHei" w:hAnsi="Arial"/>
           <w:sz w:val="20"/>
           <w:lang w:eastAsia="zh-TW"/>
         </w:rPr>
-        <w:t>免診金</w:t>
-      </w:r>
-      <w:proofErr w:type="gramEnd"/>
-      <w:r>
-        <w:rPr>
-          <w:rFonts w:ascii="Arial" w:eastAsia="Microsoft JhengHei" w:hAnsi="Arial"/>
-          <w:sz w:val="20"/>
-          <w:lang w:eastAsia="zh-TW"/>
-        </w:rPr>
-        <w:t>、高折扣促銷（與高端定位不符）</w:t>
+        <w:t>免診金、高折扣促銷（與高端定位不符）</w:t>
       </w:r>
     </w:p>
     <w:p>
@@ -7860,23 +6730,13 @@
           <w:lang w:eastAsia="zh-TW"/>
         </w:rPr>
       </w:pPr>
-      <w:proofErr w:type="gramStart"/>
       <w:r>
         <w:rPr>
           <w:rFonts w:ascii="Arial" w:eastAsia="Microsoft JhengHei" w:hAnsi="Arial"/>
           <w:sz w:val="20"/>
           <w:lang w:eastAsia="zh-TW"/>
         </w:rPr>
-        <w:t>論壇軟文</w:t>
-      </w:r>
-      <w:proofErr w:type="gramEnd"/>
-      <w:r>
-        <w:rPr>
-          <w:rFonts w:ascii="Arial" w:eastAsia="Microsoft JhengHei" w:hAnsi="Arial"/>
-          <w:sz w:val="20"/>
-          <w:lang w:eastAsia="zh-TW"/>
-        </w:rPr>
-        <w:t>、誇大療效表述</w:t>
+        <w:t>論壇軟文、誇大療效表述</w:t>
       </w:r>
     </w:p>
     <w:p>
@@ -8203,41 +7063,13 @@
           <w:lang w:eastAsia="zh-TW"/>
         </w:rPr>
       </w:pPr>
-      <w:proofErr w:type="gramStart"/>
       <w:r>
         <w:rPr>
           <w:rFonts w:ascii="Arial" w:eastAsia="Microsoft JhengHei" w:hAnsi="Arial"/>
           <w:sz w:val="21"/>
           <w:lang w:eastAsia="zh-TW"/>
         </w:rPr>
-        <w:t>舊官網</w:t>
-      </w:r>
-      <w:proofErr w:type="gramEnd"/>
-      <w:r>
-        <w:rPr>
-          <w:rFonts w:ascii="Arial" w:eastAsia="Microsoft JhengHei" w:hAnsi="Arial"/>
-          <w:sz w:val="21"/>
-          <w:lang w:eastAsia="zh-TW"/>
-        </w:rPr>
-        <w:t>內容單薄，難以承接搜尋與轉介；</w:t>
-      </w:r>
-      <w:proofErr w:type="gramStart"/>
-      <w:r>
-        <w:rPr>
-          <w:rFonts w:ascii="Arial" w:eastAsia="Microsoft JhengHei" w:hAnsi="Arial"/>
-          <w:sz w:val="21"/>
-          <w:lang w:eastAsia="zh-TW"/>
-        </w:rPr>
-        <w:t>新官網已</w:t>
-      </w:r>
-      <w:proofErr w:type="gramEnd"/>
-      <w:r>
-        <w:rPr>
-          <w:rFonts w:ascii="Arial" w:eastAsia="Microsoft JhengHei" w:hAnsi="Arial"/>
-          <w:sz w:val="21"/>
-          <w:lang w:eastAsia="zh-TW"/>
-        </w:rPr>
-        <w:t>在架構、內容、預約動線與視覺呈現（霧藍宣紙、墨藍文字、隸書印章）上系統補足，並刻意保持中環高端、合規、專業的調性。</w:t>
+        <w:t>舊官網內容單薄，難以承接搜尋與轉介；新官網已在架構、內容、預約動線與視覺呈現（霧藍宣紙、墨藍文字、隸書印章）上系統補足，並刻意保持中環高端、合規、專業的調性。</w:t>
       </w:r>
     </w:p>
     <w:p>
@@ -8253,25 +7085,7 @@
           <w:sz w:val="21"/>
           <w:lang w:eastAsia="zh-TW"/>
         </w:rPr>
-        <w:t>建議下一步：完成正式網域切換、接上數據統計，並按月度方案持續發布內容與優化廣告，讓「找到我們」的客人，能順利「</w:t>
-      </w:r>
-      <w:proofErr w:type="gramStart"/>
-      <w:r>
-        <w:rPr>
-          <w:rFonts w:ascii="Arial" w:eastAsia="Microsoft JhengHei" w:hAnsi="Arial"/>
-          <w:sz w:val="21"/>
-          <w:lang w:eastAsia="zh-TW"/>
-        </w:rPr>
-        <w:t>預約到診</w:t>
-      </w:r>
-      <w:proofErr w:type="gramEnd"/>
-      <w:r>
-        <w:rPr>
-          <w:rFonts w:ascii="Arial" w:eastAsia="Microsoft JhengHei" w:hAnsi="Arial"/>
-          <w:sz w:val="21"/>
-          <w:lang w:eastAsia="zh-TW"/>
-        </w:rPr>
-        <w:t>」。</w:t>
+        <w:t>建議下一步：完成正式網域切換、接上數據統計，並按月度方案持續發布內容與優化廣告，讓「找到我們」的客人，能順利「預約到診」。</w:t>
       </w:r>
     </w:p>
     <w:p>
@@ -8389,7 +7203,7 @@
       <w:pPr>
         <w:spacing w:after="100"/>
         <w:rPr>
-          <w:rFonts w:eastAsia="宋体" w:hint="eastAsia"/>
+          <w:rFonts w:eastAsia="宋体"/>
           <w:lang w:eastAsia="zh-CN"/>
         </w:rPr>
       </w:pPr>

</xml_diff>